<commit_message>
P0-Fixes Stufe 2: Platzhalter-Stil-Leak bei --data (P0-1), Key-Migration ANSCREIBEN/KENNNTNIS → ANSCHREIBEN/KENNTNIS (P0-2), Master neu gerendert
</commit_message>
<xml_diff>
--- a/Bewerbungsmappe_Vorlage.docx
+++ b/Bewerbungsmappe_Vorlage.docx
@@ -843,7 +843,7 @@
         <w:rPr>
           <w:rStyle w:val="MappePlatzhalter"/>
         </w:rPr>
-        <w:t xml:space="preserve">[DATUM_ANSCREIBEN]</w:t>
+        <w:t xml:space="preserve">[DATUM_ANSCHREIBEN]</w:t>
       </w:r>
     </w:p>
     <w:p>
@@ -917,7 +917,7 @@
         <w:rPr>
           <w:rStyle w:val="MappePlatzhalter"/>
         </w:rPr>
-        <w:t xml:space="preserve">[ANSCREIBEN_EINSTIEG]</w:t>
+        <w:t xml:space="preserve">[ANSCHREIBEN_EINSTIEG]</w:t>
       </w:r>
     </w:p>
     <w:p>
@@ -929,7 +929,7 @@
         <w:rPr>
           <w:rStyle w:val="MappePlatzhalter"/>
         </w:rPr>
-        <w:t xml:space="preserve">[ANSCREIBEN_BERUF]</w:t>
+        <w:t xml:space="preserve">[ANSCHREIBEN_BERUF]</w:t>
       </w:r>
     </w:p>
     <w:p>
@@ -941,7 +941,7 @@
         <w:rPr>
           <w:rStyle w:val="MappePlatzhalter"/>
         </w:rPr>
-        <w:t xml:space="preserve">[ANSCREIBEN_PRAXIS]</w:t>
+        <w:t xml:space="preserve">[ANSCHREIBEN_PRAXIS]</w:t>
       </w:r>
     </w:p>
     <w:p>
@@ -953,7 +953,7 @@
         <w:rPr>
           <w:rStyle w:val="MappePlatzhalter"/>
         </w:rPr>
-        <w:t xml:space="preserve">[ANSCREIBEN_ABSCHLUSS]</w:t>
+        <w:t xml:space="preserve">[ANSCHREIBEN_ABSCHLUSS]</w:t>
       </w:r>
     </w:p>
     <w:p>
@@ -965,7 +965,7 @@
         <w:rPr>
           <w:rStyle w:val="MappePlatzhalter"/>
         </w:rPr>
-        <w:t xml:space="preserve">[ANSCREIBEN_SCHLUSS]</w:t>
+        <w:t xml:space="preserve">[ANSCHREIBEN_SCHLUSS]</w:t>
       </w:r>
     </w:p>
     <w:p>
@@ -2215,7 +2215,7 @@
               <w:rPr>
                 <w:rStyle w:val="MappePlatzhalter"/>
               </w:rPr>
-              <w:t xml:space="preserve">[KENNNTNIS_SOFTWARE]</w:t>
+              <w:t xml:space="preserve">[KENNTNIS_SOFTWARE]</w:t>
             </w:r>
             <w:r>
               <w:t xml:space="preserve"> — </w:t>
@@ -2224,7 +2224,7 @@
               <w:rPr>
                 <w:rStyle w:val="MappePlatzhalter"/>
               </w:rPr>
-              <w:t xml:space="preserve">[KENNNTNIS_SOFTWARE_LEVEL]</w:t>
+              <w:t xml:space="preserve">[KENNTNIS_SOFTWARE_LEVEL]</w:t>
             </w:r>
           </w:p>
         </w:tc>
@@ -2335,7 +2335,7 @@
               <w:rPr>
                 <w:rStyle w:val="MappePlatzhalter"/>
               </w:rPr>
-              <w:t xml:space="preserve">[KENNNTNIS_SPRACHE]</w:t>
+              <w:t xml:space="preserve">[KENNTNIS_SPRACHE]</w:t>
             </w:r>
             <w:r>
               <w:t xml:space="preserve"> — </w:t>
@@ -2344,7 +2344,7 @@
               <w:rPr>
                 <w:rStyle w:val="MappePlatzhalter"/>
               </w:rPr>
-              <w:t xml:space="preserve">[KENNNTNIS_SPRACHE_LEVEL]</w:t>
+              <w:t xml:space="preserve">[KENNTNIS_SPRACHE_LEVEL]</w:t>
             </w:r>
           </w:p>
         </w:tc>
@@ -2455,7 +2455,7 @@
               <w:rPr>
                 <w:rStyle w:val="MappePlatzhalter"/>
               </w:rPr>
-              <w:t xml:space="preserve">[KENNNTNIS_CAD]</w:t>
+              <w:t xml:space="preserve">[KENNTNIS_CAD]</w:t>
             </w:r>
           </w:p>
         </w:tc>

</xml_diff>